<commit_message>
chore: update front page template from user downloads
</commit_message>
<xml_diff>
--- a/public/template_depan_v2.docx
+++ b/public/template_depan_v2.docx
@@ -13,6 +13,9 @@
     </w:p>
     <w:p>
       <w:pPr>
+        <w:tabs>
+          <w:tab w:val="left" w:pos="2552"/>
+        </w:tabs>
         <w:rPr>
           <w:rFonts w:ascii="Arial" w:hAnsi="Arial" w:cs="Arial"/>
           <w:sz w:val="20"/>
@@ -28,7 +31,7 @@
           <w:lang w:bidi="ar-SA"/>
         </w:rPr>
         <w:drawing>
-          <wp:anchor distT="0" distB="0" distL="114300" distR="114300" simplePos="0" relativeHeight="251648000" behindDoc="0" locked="0" layoutInCell="1" allowOverlap="1" wp14:anchorId="7355D5E3" wp14:editId="3EFB4AD8">
+          <wp:anchor distT="0" distB="0" distL="114300" distR="114300" simplePos="0" relativeHeight="251648000" behindDoc="0" locked="0" layoutInCell="1" allowOverlap="1" wp14:anchorId="7355D5E3" wp14:editId="75500458">
             <wp:simplePos x="0" y="0"/>
             <wp:positionH relativeFrom="margin">
               <wp:posOffset>1299176</wp:posOffset>
@@ -251,31 +254,50 @@
     <w:p>
       <w:pPr>
         <w:tabs>
+          <w:tab w:val="left" w:pos="720"/>
+          <w:tab w:val="left" w:pos="3686"/>
           <w:tab w:val="left" w:pos="4395"/>
         </w:tabs>
-        <w:ind w:left="720" w:firstLine="698"/>
-        <w:rPr>
-          <w:rFonts w:ascii="Arial" w:hAnsi="Arial" w:cs="Arial"/>
-          <w:sz w:val="28"/>
-          <w:szCs w:val="28"/>
-        </w:rPr>
-      </w:pPr>
-      <w:r>
-        <w:rPr>
-          <w:rFonts w:ascii="Arial" w:hAnsi="Arial" w:cs="Arial"/>
-          <w:sz w:val="28"/>
-          <w:szCs w:val="28"/>
-        </w:rPr>
-        <w:t xml:space="preserve">Nama Anak Didik  </w:t>
-      </w:r>
-      <w:r>
-        <w:rPr>
-          <w:rFonts w:ascii="Arial" w:hAnsi="Arial" w:cs="Arial"/>
-          <w:sz w:val="28"/>
-          <w:szCs w:val="28"/>
-        </w:rPr>
-        <w:tab/>
-      </w:r>
+        <w:rPr>
+          <w:rFonts w:ascii="Arial" w:hAnsi="Arial" w:cs="Arial"/>
+          <w:sz w:val="28"/>
+          <w:szCs w:val="28"/>
+        </w:rPr>
+      </w:pPr>
+      <w:r>
+        <w:rPr>
+          <w:rFonts w:ascii="Arial" w:hAnsi="Arial" w:cs="Arial"/>
+          <w:sz w:val="28"/>
+          <w:szCs w:val="28"/>
+        </w:rPr>
+        <w:tab/>
+      </w:r>
+      <w:r>
+        <w:rPr>
+          <w:rFonts w:ascii="Arial" w:hAnsi="Arial" w:cs="Arial"/>
+          <w:sz w:val="28"/>
+          <w:szCs w:val="28"/>
+        </w:rPr>
+        <w:t xml:space="preserve">Nama Anak </w:t>
+      </w:r>
+      <w:proofErr w:type="gramStart"/>
+      <w:r>
+        <w:rPr>
+          <w:rFonts w:ascii="Arial" w:hAnsi="Arial" w:cs="Arial"/>
+          <w:sz w:val="28"/>
+          <w:szCs w:val="28"/>
+        </w:rPr>
+        <w:t xml:space="preserve">Didik  </w:t>
+      </w:r>
+      <w:r>
+        <w:rPr>
+          <w:rFonts w:ascii="Arial" w:hAnsi="Arial" w:cs="Arial"/>
+          <w:sz w:val="28"/>
+          <w:szCs w:val="28"/>
+        </w:rPr>
+        <w:tab/>
+      </w:r>
+      <w:proofErr w:type="gramEnd"/>
       <w:r>
         <w:rPr>
           <w:rFonts w:ascii="Arial" w:hAnsi="Arial" w:cs="Arial"/>
@@ -284,6 +306,7 @@
         </w:rPr>
         <w:t>: {</w:t>
       </w:r>
+      <w:proofErr w:type="spellStart"/>
       <w:r>
         <w:rPr>
           <w:rFonts w:ascii="Arial" w:hAnsi="Arial" w:cs="Arial"/>
@@ -292,6 +315,7 @@
         </w:rPr>
         <w:t>nama_lengkap</w:t>
       </w:r>
+      <w:proofErr w:type="spellEnd"/>
       <w:r>
         <w:rPr>
           <w:rFonts w:ascii="Arial" w:hAnsi="Arial" w:cs="Arial"/>
@@ -299,36 +323,30 @@
           <w:szCs w:val="28"/>
         </w:rPr>
         <w:t>}</w:t>
-      </w:r>
-      <w:r>
-        <w:rPr>
-          <w:rFonts w:ascii="Arial" w:hAnsi="Arial" w:cs="Arial"/>
-          <w:sz w:val="28"/>
-          <w:szCs w:val="28"/>
-        </w:rPr>
-        <w:tab/>
-      </w:r>
-      <w:r>
-        <w:rPr>
-          <w:rFonts w:ascii="Arial" w:hAnsi="Arial" w:cs="Arial"/>
-          <w:sz w:val="28"/>
-          <w:szCs w:val="28"/>
-        </w:rPr>
-        <w:tab/>
       </w:r>
     </w:p>
     <w:p>
       <w:pPr>
         <w:tabs>
+          <w:tab w:val="left" w:pos="720"/>
+          <w:tab w:val="left" w:pos="3686"/>
           <w:tab w:val="left" w:pos="4395"/>
         </w:tabs>
-        <w:ind w:left="720" w:firstLine="720"/>
-        <w:rPr>
-          <w:rFonts w:ascii="Arial" w:hAnsi="Arial" w:cs="Arial"/>
-          <w:sz w:val="28"/>
-          <w:szCs w:val="28"/>
-        </w:rPr>
-      </w:pPr>
+        <w:rPr>
+          <w:rFonts w:ascii="Arial" w:hAnsi="Arial" w:cs="Arial"/>
+          <w:sz w:val="28"/>
+          <w:szCs w:val="28"/>
+        </w:rPr>
+      </w:pPr>
+      <w:r>
+        <w:rPr>
+          <w:rFonts w:ascii="Arial" w:hAnsi="Arial" w:cs="Arial"/>
+          <w:sz w:val="28"/>
+          <w:szCs w:val="28"/>
+        </w:rPr>
+        <w:tab/>
+      </w:r>
+      <w:proofErr w:type="spellStart"/>
       <w:r>
         <w:rPr>
           <w:rFonts w:ascii="Arial" w:hAnsi="Arial" w:cs="Arial"/>
@@ -337,6 +355,7 @@
         </w:rPr>
         <w:t>Nomor</w:t>
       </w:r>
+      <w:proofErr w:type="spellEnd"/>
       <w:r>
         <w:rPr>
           <w:rFonts w:ascii="Arial" w:hAnsi="Arial" w:cs="Arial"/>
@@ -345,6 +364,7 @@
         </w:rPr>
         <w:t xml:space="preserve"> </w:t>
       </w:r>
+      <w:proofErr w:type="spellStart"/>
       <w:r>
         <w:rPr>
           <w:rFonts w:ascii="Arial" w:hAnsi="Arial" w:cs="Arial"/>
@@ -353,6 +373,7 @@
         </w:rPr>
         <w:t>Induk</w:t>
       </w:r>
+      <w:proofErr w:type="spellEnd"/>
       <w:r>
         <w:rPr>
           <w:rFonts w:ascii="Arial" w:hAnsi="Arial" w:cs="Arial"/>
@@ -383,23 +404,7 @@
           <w:sz w:val="28"/>
           <w:szCs w:val="28"/>
         </w:rPr>
-        <w:t>{</w:t>
-      </w:r>
-      <w:r>
-        <w:rPr>
-          <w:rFonts w:ascii="Arial" w:hAnsi="Arial" w:cs="Arial"/>
-          <w:sz w:val="28"/>
-          <w:szCs w:val="28"/>
-        </w:rPr>
-        <w:t>nipd</w:t>
-      </w:r>
-      <w:r>
-        <w:rPr>
-          <w:rFonts w:ascii="Arial" w:hAnsi="Arial" w:cs="Arial"/>
-          <w:sz w:val="28"/>
-          <w:szCs w:val="28"/>
-        </w:rPr>
-        <w:t>} / {nisn}</w:t>
+        <w:t>{nipd} / {nisn}</w:t>
       </w:r>
       <w:r>
         <w:rPr>
@@ -415,15 +420,24 @@
     <w:p>
       <w:pPr>
         <w:tabs>
+          <w:tab w:val="left" w:pos="720"/>
+          <w:tab w:val="left" w:pos="3686"/>
           <w:tab w:val="left" w:pos="4395"/>
         </w:tabs>
-        <w:ind w:left="720" w:firstLine="720"/>
-        <w:rPr>
-          <w:rFonts w:ascii="Arial" w:hAnsi="Arial" w:cs="Arial"/>
-          <w:sz w:val="28"/>
-          <w:szCs w:val="28"/>
-        </w:rPr>
-      </w:pPr>
+        <w:rPr>
+          <w:rFonts w:ascii="Arial" w:hAnsi="Arial" w:cs="Arial"/>
+          <w:sz w:val="28"/>
+          <w:szCs w:val="28"/>
+        </w:rPr>
+      </w:pPr>
+      <w:r>
+        <w:rPr>
+          <w:rFonts w:ascii="Arial" w:hAnsi="Arial" w:cs="Arial"/>
+          <w:sz w:val="28"/>
+          <w:szCs w:val="28"/>
+        </w:rPr>
+        <w:tab/>
+      </w:r>
       <w:r>
         <w:rPr>
           <w:rFonts w:ascii="Arial" w:hAnsi="Arial" w:cs="Arial"/>
@@ -448,6 +462,7 @@
         </w:rPr>
         <w:t>: {</w:t>
       </w:r>
+      <w:proofErr w:type="spellStart"/>
       <w:r>
         <w:rPr>
           <w:rFonts w:ascii="Arial" w:hAnsi="Arial" w:cs="Arial"/>
@@ -456,6 +471,7 @@
         </w:rPr>
         <w:t>nama_tk_lembaga</w:t>
       </w:r>
+      <w:proofErr w:type="spellEnd"/>
       <w:r>
         <w:rPr>
           <w:rFonts w:ascii="Arial" w:hAnsi="Arial" w:cs="Arial"/>
@@ -463,22 +479,6 @@
           <w:szCs w:val="28"/>
         </w:rPr>
         <w:t>}</w:t>
-      </w:r>
-      <w:r>
-        <w:rPr>
-          <w:rFonts w:ascii="Arial" w:hAnsi="Arial" w:cs="Arial"/>
-          <w:sz w:val="28"/>
-          <w:szCs w:val="28"/>
-        </w:rPr>
-        <w:tab/>
-      </w:r>
-      <w:r>
-        <w:rPr>
-          <w:rFonts w:ascii="Arial" w:hAnsi="Arial" w:cs="Arial"/>
-          <w:sz w:val="28"/>
-          <w:szCs w:val="28"/>
-        </w:rPr>
-        <w:tab/>
       </w:r>
       <w:r>
         <w:rPr>
@@ -492,31 +492,50 @@
     <w:p>
       <w:pPr>
         <w:tabs>
+          <w:tab w:val="left" w:pos="720"/>
+          <w:tab w:val="left" w:pos="3686"/>
           <w:tab w:val="left" w:pos="4395"/>
         </w:tabs>
-        <w:ind w:left="720" w:firstLine="720"/>
-        <w:rPr>
-          <w:rFonts w:ascii="Arial" w:hAnsi="Arial" w:cs="Arial"/>
-          <w:sz w:val="28"/>
-          <w:szCs w:val="28"/>
-        </w:rPr>
-      </w:pPr>
-      <w:r>
-        <w:rPr>
-          <w:rFonts w:ascii="Arial" w:hAnsi="Arial" w:cs="Arial"/>
-          <w:sz w:val="28"/>
-          <w:szCs w:val="28"/>
-        </w:rPr>
-        <w:t xml:space="preserve">NSS / NPSN  </w:t>
-      </w:r>
-      <w:r>
-        <w:rPr>
-          <w:rFonts w:ascii="Arial" w:hAnsi="Arial" w:cs="Arial"/>
-          <w:sz w:val="28"/>
-          <w:szCs w:val="28"/>
-        </w:rPr>
-        <w:tab/>
-      </w:r>
+        <w:rPr>
+          <w:rFonts w:ascii="Arial" w:hAnsi="Arial" w:cs="Arial"/>
+          <w:sz w:val="28"/>
+          <w:szCs w:val="28"/>
+        </w:rPr>
+      </w:pPr>
+      <w:r>
+        <w:rPr>
+          <w:rFonts w:ascii="Arial" w:hAnsi="Arial" w:cs="Arial"/>
+          <w:sz w:val="28"/>
+          <w:szCs w:val="28"/>
+        </w:rPr>
+        <w:tab/>
+      </w:r>
+      <w:r>
+        <w:rPr>
+          <w:rFonts w:ascii="Arial" w:hAnsi="Arial" w:cs="Arial"/>
+          <w:sz w:val="28"/>
+          <w:szCs w:val="28"/>
+        </w:rPr>
+        <w:t xml:space="preserve">NSS / </w:t>
+      </w:r>
+      <w:proofErr w:type="gramStart"/>
+      <w:r>
+        <w:rPr>
+          <w:rFonts w:ascii="Arial" w:hAnsi="Arial" w:cs="Arial"/>
+          <w:sz w:val="28"/>
+          <w:szCs w:val="28"/>
+        </w:rPr>
+        <w:t xml:space="preserve">NPSN  </w:t>
+      </w:r>
+      <w:r>
+        <w:rPr>
+          <w:rFonts w:ascii="Arial" w:hAnsi="Arial" w:cs="Arial"/>
+          <w:sz w:val="28"/>
+          <w:szCs w:val="28"/>
+        </w:rPr>
+        <w:tab/>
+      </w:r>
+      <w:proofErr w:type="gramEnd"/>
       <w:r>
         <w:rPr>
           <w:rFonts w:ascii="Arial" w:hAnsi="Arial" w:cs="Arial"/>
@@ -525,6 +544,7 @@
         </w:rPr>
         <w:t>: {</w:t>
       </w:r>
+      <w:proofErr w:type="spellStart"/>
       <w:r>
         <w:rPr>
           <w:rFonts w:ascii="Arial" w:hAnsi="Arial" w:cs="Arial"/>
@@ -533,6 +553,7 @@
         </w:rPr>
         <w:t>nss_npsn_lembaga</w:t>
       </w:r>
+      <w:proofErr w:type="spellEnd"/>
       <w:r>
         <w:rPr>
           <w:rFonts w:ascii="Arial" w:hAnsi="Arial" w:cs="Arial"/>
@@ -540,14 +561,6 @@
           <w:szCs w:val="28"/>
         </w:rPr>
         <w:t>}</w:t>
-      </w:r>
-      <w:r>
-        <w:rPr>
-          <w:rFonts w:ascii="Arial" w:hAnsi="Arial" w:cs="Arial"/>
-          <w:sz w:val="28"/>
-          <w:szCs w:val="28"/>
-        </w:rPr>
-        <w:tab/>
       </w:r>
       <w:r>
         <w:rPr>
@@ -561,22 +574,175 @@
     <w:p>
       <w:pPr>
         <w:tabs>
+          <w:tab w:val="left" w:pos="720"/>
+          <w:tab w:val="left" w:pos="3686"/>
+        </w:tabs>
+        <w:ind w:left="720" w:hanging="11"/>
+        <w:rPr>
+          <w:rFonts w:ascii="Arial" w:hAnsi="Arial" w:cs="Arial"/>
+          <w:sz w:val="28"/>
+          <w:szCs w:val="28"/>
+        </w:rPr>
+      </w:pPr>
+      <w:r>
+        <w:rPr>
+          <w:rFonts w:ascii="Arial" w:hAnsi="Arial" w:cs="Arial"/>
+          <w:sz w:val="28"/>
+          <w:szCs w:val="28"/>
+        </w:rPr>
+        <w:tab/>
+      </w:r>
+      <w:r>
+        <w:rPr>
+          <w:rFonts w:ascii="Arial" w:hAnsi="Arial" w:cs="Arial"/>
+          <w:sz w:val="28"/>
+          <w:szCs w:val="28"/>
+        </w:rPr>
+        <w:t xml:space="preserve">ALAMAT TK </w:t>
+      </w:r>
+      <w:r>
+        <w:rPr>
+          <w:rFonts w:ascii="Arial" w:hAnsi="Arial" w:cs="Arial"/>
+          <w:sz w:val="28"/>
+          <w:szCs w:val="28"/>
+        </w:rPr>
+        <w:tab/>
+        <w:t>: {</w:t>
+      </w:r>
+      <w:proofErr w:type="spellStart"/>
+      <w:r>
+        <w:rPr>
+          <w:rFonts w:ascii="Arial" w:hAnsi="Arial" w:cs="Arial"/>
+          <w:sz w:val="28"/>
+          <w:szCs w:val="28"/>
+        </w:rPr>
+        <w:t>alamat_tk_lembaga</w:t>
+      </w:r>
+      <w:proofErr w:type="spellEnd"/>
+      <w:r>
+        <w:rPr>
+          <w:rFonts w:ascii="Arial" w:hAnsi="Arial" w:cs="Arial"/>
+          <w:sz w:val="28"/>
+          <w:szCs w:val="28"/>
+        </w:rPr>
+        <w:t>}</w:t>
+      </w:r>
+      <w:r>
+        <w:rPr>
+          <w:rFonts w:ascii="Arial" w:hAnsi="Arial" w:cs="Arial"/>
+          <w:sz w:val="28"/>
+          <w:szCs w:val="28"/>
+        </w:rPr>
+        <w:br/>
+      </w:r>
+      <w:r>
+        <w:rPr>
+          <w:rFonts w:ascii="Arial" w:hAnsi="Arial" w:cs="Arial"/>
+          <w:sz w:val="28"/>
+          <w:szCs w:val="28"/>
+        </w:rPr>
+        <w:t xml:space="preserve">  </w:t>
+      </w:r>
+      <w:r>
+        <w:rPr>
+          <w:rFonts w:ascii="Arial" w:hAnsi="Arial" w:cs="Arial"/>
+          <w:sz w:val="28"/>
+          <w:szCs w:val="28"/>
+        </w:rPr>
+        <w:tab/>
+        <w:t xml:space="preserve">  </w:t>
+      </w:r>
+      <w:r>
+        <w:rPr>
+          <w:rFonts w:ascii="Arial" w:hAnsi="Arial" w:cs="Arial"/>
+          <w:sz w:val="28"/>
+          <w:szCs w:val="28"/>
+        </w:rPr>
+        <w:t xml:space="preserve">KODE </w:t>
+      </w:r>
+      <w:proofErr w:type="gramStart"/>
+      <w:r>
+        <w:rPr>
+          <w:rFonts w:ascii="Arial" w:hAnsi="Arial" w:cs="Arial"/>
+          <w:sz w:val="28"/>
+          <w:szCs w:val="28"/>
+        </w:rPr>
+        <w:t>POS :</w:t>
+      </w:r>
+      <w:proofErr w:type="gramEnd"/>
+      <w:r>
+        <w:rPr>
+          <w:rFonts w:ascii="Arial" w:hAnsi="Arial" w:cs="Arial"/>
+          <w:sz w:val="28"/>
+          <w:szCs w:val="28"/>
+        </w:rPr>
+        <w:t xml:space="preserve"> {</w:t>
+      </w:r>
+      <w:proofErr w:type="spellStart"/>
+      <w:r>
+        <w:rPr>
+          <w:rFonts w:ascii="Arial" w:hAnsi="Arial" w:cs="Arial"/>
+          <w:sz w:val="28"/>
+          <w:szCs w:val="28"/>
+        </w:rPr>
+        <w:t>kode_pos_lembaga</w:t>
+      </w:r>
+      <w:proofErr w:type="spellEnd"/>
+      <w:r>
+        <w:rPr>
+          <w:rFonts w:ascii="Arial" w:hAnsi="Arial" w:cs="Arial"/>
+          <w:sz w:val="28"/>
+          <w:szCs w:val="28"/>
+        </w:rPr>
+        <w:t>}</w:t>
+      </w:r>
+      <w:r>
+        <w:rPr>
+          <w:rFonts w:ascii="Arial" w:hAnsi="Arial" w:cs="Arial"/>
+          <w:sz w:val="28"/>
+          <w:szCs w:val="28"/>
+        </w:rPr>
+        <w:t xml:space="preserve"> </w:t>
+      </w:r>
+      <w:proofErr w:type="gramStart"/>
+      <w:r>
+        <w:rPr>
+          <w:rFonts w:ascii="Arial" w:hAnsi="Arial" w:cs="Arial"/>
+          <w:sz w:val="28"/>
+          <w:szCs w:val="28"/>
+        </w:rPr>
+        <w:t>TELEPON :</w:t>
+      </w:r>
+      <w:proofErr w:type="gramEnd"/>
+    </w:p>
+    <w:p>
+      <w:pPr>
+        <w:tabs>
+          <w:tab w:val="left" w:pos="720"/>
+          <w:tab w:val="left" w:pos="3686"/>
           <w:tab w:val="left" w:pos="4395"/>
         </w:tabs>
-        <w:ind w:left="4395" w:hanging="2955"/>
-        <w:rPr>
-          <w:rFonts w:ascii="Arial" w:hAnsi="Arial" w:cs="Arial"/>
-          <w:sz w:val="28"/>
-          <w:szCs w:val="28"/>
-        </w:rPr>
-      </w:pPr>
-      <w:r>
-        <w:rPr>
-          <w:rFonts w:ascii="Arial" w:hAnsi="Arial" w:cs="Arial"/>
-          <w:sz w:val="28"/>
-          <w:szCs w:val="28"/>
-        </w:rPr>
-        <w:t xml:space="preserve">ALAMAT TK </w:t>
+        <w:rPr>
+          <w:rFonts w:ascii="Arial" w:hAnsi="Arial" w:cs="Arial"/>
+          <w:sz w:val="28"/>
+          <w:szCs w:val="28"/>
+        </w:rPr>
+      </w:pPr>
+      <w:r>
+        <w:rPr>
+          <w:rFonts w:ascii="Arial" w:hAnsi="Arial" w:cs="Arial"/>
+          <w:sz w:val="28"/>
+          <w:szCs w:val="28"/>
+        </w:rPr>
+        <w:tab/>
+      </w:r>
+      <w:r>
+        <w:rPr>
+          <w:rFonts w:ascii="Arial" w:hAnsi="Arial" w:cs="Arial"/>
+          <w:sz w:val="28"/>
+          <w:szCs w:val="28"/>
+        </w:rPr>
+        <w:t xml:space="preserve">DESA /KELURAHAN </w:t>
       </w:r>
       <w:r>
         <w:rPr>
@@ -587,14 +753,16 @@
         <w:tab/>
         <w:t>: {</w:t>
       </w:r>
-      <w:r>
-        <w:rPr>
-          <w:rFonts w:ascii="Arial" w:hAnsi="Arial" w:cs="Arial"/>
-          <w:sz w:val="28"/>
-          <w:szCs w:val="28"/>
-        </w:rPr>
-        <w:t>alamat_tk_lembaga</w:t>
-      </w:r>
+      <w:proofErr w:type="spellStart"/>
+      <w:r>
+        <w:rPr>
+          <w:rFonts w:ascii="Arial" w:hAnsi="Arial" w:cs="Arial"/>
+          <w:sz w:val="28"/>
+          <w:szCs w:val="28"/>
+        </w:rPr>
+        <w:t>desa_lembaga</w:t>
+      </w:r>
+      <w:proofErr w:type="spellEnd"/>
       <w:r>
         <w:rPr>
           <w:rFonts w:ascii="Arial" w:hAnsi="Arial" w:cs="Arial"/>
@@ -609,69 +777,37 @@
           <w:sz w:val="28"/>
           <w:szCs w:val="28"/>
         </w:rPr>
-        <w:br/>
-        <w:t xml:space="preserve">  </w:t>
-      </w:r>
-      <w:r>
-        <w:rPr>
-          <w:rFonts w:ascii="Arial" w:hAnsi="Arial" w:cs="Arial"/>
-          <w:sz w:val="28"/>
-          <w:szCs w:val="28"/>
-        </w:rPr>
-        <w:t>KODE POS : {</w:t>
-      </w:r>
-      <w:r>
-        <w:rPr>
-          <w:rFonts w:ascii="Arial" w:hAnsi="Arial" w:cs="Arial"/>
-          <w:sz w:val="28"/>
-          <w:szCs w:val="28"/>
-        </w:rPr>
-        <w:t>kode_pos_lembaga</w:t>
-      </w:r>
-      <w:r>
-        <w:rPr>
-          <w:rFonts w:ascii="Arial" w:hAnsi="Arial" w:cs="Arial"/>
-          <w:sz w:val="28"/>
-          <w:szCs w:val="28"/>
-        </w:rPr>
-        <w:t>}</w:t>
-      </w:r>
-      <w:r>
-        <w:rPr>
-          <w:rFonts w:ascii="Arial" w:hAnsi="Arial" w:cs="Arial"/>
-          <w:sz w:val="28"/>
-          <w:szCs w:val="28"/>
-        </w:rPr>
-        <w:t xml:space="preserve">  </w:t>
-      </w:r>
-      <w:r>
-        <w:rPr>
-          <w:rFonts w:ascii="Arial" w:hAnsi="Arial" w:cs="Arial"/>
-          <w:sz w:val="28"/>
-          <w:szCs w:val="28"/>
-        </w:rPr>
-        <w:t>TELEPON :</w:t>
+        <w:tab/>
       </w:r>
     </w:p>
     <w:p>
       <w:pPr>
         <w:tabs>
+          <w:tab w:val="left" w:pos="720"/>
+          <w:tab w:val="left" w:pos="3686"/>
           <w:tab w:val="left" w:pos="4395"/>
         </w:tabs>
-        <w:ind w:left="720" w:firstLine="720"/>
-        <w:rPr>
-          <w:rFonts w:ascii="Arial" w:hAnsi="Arial" w:cs="Arial"/>
-          <w:sz w:val="28"/>
-          <w:szCs w:val="28"/>
-        </w:rPr>
-      </w:pPr>
-      <w:r>
-        <w:rPr>
-          <w:rFonts w:ascii="Arial" w:hAnsi="Arial" w:cs="Arial"/>
-          <w:sz w:val="28"/>
-          <w:szCs w:val="28"/>
-        </w:rPr>
-        <w:t xml:space="preserve">DESA /KELURAHAN </w:t>
+        <w:rPr>
+          <w:rFonts w:ascii="Arial" w:hAnsi="Arial" w:cs="Arial"/>
+          <w:sz w:val="28"/>
+          <w:szCs w:val="28"/>
+        </w:rPr>
+      </w:pPr>
+      <w:r>
+        <w:rPr>
+          <w:rFonts w:ascii="Arial" w:hAnsi="Arial" w:cs="Arial"/>
+          <w:sz w:val="28"/>
+          <w:szCs w:val="28"/>
+        </w:rPr>
+        <w:tab/>
+      </w:r>
+      <w:r>
+        <w:rPr>
+          <w:rFonts w:ascii="Arial" w:hAnsi="Arial" w:cs="Arial"/>
+          <w:sz w:val="28"/>
+          <w:szCs w:val="28"/>
+        </w:rPr>
+        <w:t xml:space="preserve">KECAMATAN </w:t>
       </w:r>
       <w:r>
         <w:rPr>
@@ -682,14 +818,16 @@
         <w:tab/>
         <w:t>: {</w:t>
       </w:r>
-      <w:r>
-        <w:rPr>
-          <w:rFonts w:ascii="Arial" w:hAnsi="Arial" w:cs="Arial"/>
-          <w:sz w:val="28"/>
-          <w:szCs w:val="28"/>
-        </w:rPr>
-        <w:t>desa_lembaga</w:t>
-      </w:r>
+      <w:proofErr w:type="spellStart"/>
+      <w:r>
+        <w:rPr>
+          <w:rFonts w:ascii="Arial" w:hAnsi="Arial" w:cs="Arial"/>
+          <w:sz w:val="28"/>
+          <w:szCs w:val="28"/>
+        </w:rPr>
+        <w:t>kec_lembaga</w:t>
+      </w:r>
+      <w:proofErr w:type="spellEnd"/>
       <w:r>
         <w:rPr>
           <w:rFonts w:ascii="Arial" w:hAnsi="Arial" w:cs="Arial"/>
@@ -697,6 +835,14 @@
           <w:szCs w:val="28"/>
         </w:rPr>
         <w:t>}</w:t>
+      </w:r>
+      <w:r>
+        <w:rPr>
+          <w:rFonts w:ascii="Arial" w:hAnsi="Arial" w:cs="Arial"/>
+          <w:sz w:val="28"/>
+          <w:szCs w:val="28"/>
+        </w:rPr>
+        <w:tab/>
       </w:r>
       <w:r>
         <w:rPr>
@@ -710,40 +856,58 @@
     <w:p>
       <w:pPr>
         <w:tabs>
+          <w:tab w:val="left" w:pos="720"/>
+          <w:tab w:val="left" w:pos="3686"/>
           <w:tab w:val="left" w:pos="4395"/>
         </w:tabs>
-        <w:ind w:left="720" w:firstLine="720"/>
-        <w:rPr>
-          <w:rFonts w:ascii="Arial" w:hAnsi="Arial" w:cs="Arial"/>
-          <w:sz w:val="28"/>
-          <w:szCs w:val="28"/>
-        </w:rPr>
-      </w:pPr>
-      <w:r>
-        <w:rPr>
-          <w:rFonts w:ascii="Arial" w:hAnsi="Arial" w:cs="Arial"/>
-          <w:sz w:val="28"/>
-          <w:szCs w:val="28"/>
-        </w:rPr>
-        <w:t xml:space="preserve">KECAMATAN </w:t>
-      </w:r>
-      <w:r>
-        <w:rPr>
-          <w:rFonts w:ascii="Arial" w:hAnsi="Arial" w:cs="Arial"/>
-          <w:sz w:val="28"/>
-          <w:szCs w:val="28"/>
-        </w:rPr>
-        <w:tab/>
+        <w:rPr>
+          <w:rFonts w:ascii="Arial" w:hAnsi="Arial" w:cs="Arial"/>
+          <w:sz w:val="28"/>
+          <w:szCs w:val="28"/>
+        </w:rPr>
+      </w:pPr>
+      <w:r>
+        <w:rPr>
+          <w:rFonts w:ascii="Arial" w:hAnsi="Arial" w:cs="Arial"/>
+          <w:sz w:val="28"/>
+          <w:szCs w:val="28"/>
+        </w:rPr>
+        <w:tab/>
+      </w:r>
+      <w:r>
+        <w:rPr>
+          <w:rFonts w:ascii="Arial" w:hAnsi="Arial" w:cs="Arial"/>
+          <w:sz w:val="28"/>
+          <w:szCs w:val="28"/>
+        </w:rPr>
+        <w:t xml:space="preserve">KABUPATEN / KOTA </w:t>
+      </w:r>
+      <w:r>
+        <w:rPr>
+          <w:rFonts w:ascii="Arial" w:hAnsi="Arial" w:cs="Arial"/>
+          <w:sz w:val="28"/>
+          <w:szCs w:val="28"/>
+        </w:rPr>
+        <w:tab/>
+      </w:r>
+      <w:r>
+        <w:rPr>
+          <w:rFonts w:ascii="Arial" w:hAnsi="Arial" w:cs="Arial"/>
+          <w:sz w:val="28"/>
+          <w:szCs w:val="28"/>
+        </w:rPr>
         <w:t>: {</w:t>
       </w:r>
-      <w:r>
-        <w:rPr>
-          <w:rFonts w:ascii="Arial" w:hAnsi="Arial" w:cs="Arial"/>
-          <w:sz w:val="28"/>
-          <w:szCs w:val="28"/>
-        </w:rPr>
-        <w:t>kec_lembaga</w:t>
-      </w:r>
+      <w:proofErr w:type="spellStart"/>
+      <w:r>
+        <w:rPr>
+          <w:rFonts w:ascii="Arial" w:hAnsi="Arial" w:cs="Arial"/>
+          <w:sz w:val="28"/>
+          <w:szCs w:val="28"/>
+        </w:rPr>
+        <w:t>kab_lembaga</w:t>
+      </w:r>
+      <w:proofErr w:type="spellEnd"/>
       <w:r>
         <w:rPr>
           <w:rFonts w:ascii="Arial" w:hAnsi="Arial" w:cs="Arial"/>
@@ -751,14 +915,6 @@
           <w:szCs w:val="28"/>
         </w:rPr>
         <w:t>}</w:t>
-      </w:r>
-      <w:r>
-        <w:rPr>
-          <w:rFonts w:ascii="Arial" w:hAnsi="Arial" w:cs="Arial"/>
-          <w:sz w:val="28"/>
-          <w:szCs w:val="28"/>
-        </w:rPr>
-        <w:tab/>
       </w:r>
       <w:r>
         <w:rPr>
@@ -772,22 +928,31 @@
     <w:p>
       <w:pPr>
         <w:tabs>
+          <w:tab w:val="left" w:pos="720"/>
+          <w:tab w:val="left" w:pos="3686"/>
           <w:tab w:val="left" w:pos="4395"/>
         </w:tabs>
-        <w:ind w:left="720" w:firstLine="720"/>
-        <w:rPr>
-          <w:rFonts w:ascii="Arial" w:hAnsi="Arial" w:cs="Arial"/>
-          <w:sz w:val="28"/>
-          <w:szCs w:val="28"/>
-        </w:rPr>
-      </w:pPr>
-      <w:r>
-        <w:rPr>
-          <w:rFonts w:ascii="Arial" w:hAnsi="Arial" w:cs="Arial"/>
-          <w:sz w:val="28"/>
-          <w:szCs w:val="28"/>
-        </w:rPr>
-        <w:t xml:space="preserve">KABUPATEN / KOTA </w:t>
+        <w:rPr>
+          <w:rFonts w:ascii="Arial" w:hAnsi="Arial" w:cs="Arial"/>
+          <w:sz w:val="28"/>
+          <w:szCs w:val="28"/>
+        </w:rPr>
+      </w:pPr>
+      <w:r>
+        <w:rPr>
+          <w:rFonts w:ascii="Arial" w:hAnsi="Arial" w:cs="Arial"/>
+          <w:sz w:val="28"/>
+          <w:szCs w:val="28"/>
+        </w:rPr>
+        <w:tab/>
+      </w:r>
+      <w:r>
+        <w:rPr>
+          <w:rFonts w:ascii="Arial" w:hAnsi="Arial" w:cs="Arial"/>
+          <w:sz w:val="28"/>
+          <w:szCs w:val="28"/>
+        </w:rPr>
+        <w:t xml:space="preserve">PROVINSI    </w:t>
       </w:r>
       <w:r>
         <w:rPr>
@@ -805,67 +970,7 @@
         </w:rPr>
         <w:t>: {</w:t>
       </w:r>
-      <w:r>
-        <w:rPr>
-          <w:rFonts w:ascii="Arial" w:hAnsi="Arial" w:cs="Arial"/>
-          <w:sz w:val="28"/>
-          <w:szCs w:val="28"/>
-        </w:rPr>
-        <w:t>kab_lembaga</w:t>
-      </w:r>
-      <w:r>
-        <w:rPr>
-          <w:rFonts w:ascii="Arial" w:hAnsi="Arial" w:cs="Arial"/>
-          <w:sz w:val="28"/>
-          <w:szCs w:val="28"/>
-        </w:rPr>
-        <w:t>}</w:t>
-      </w:r>
-      <w:r>
-        <w:rPr>
-          <w:rFonts w:ascii="Arial" w:hAnsi="Arial" w:cs="Arial"/>
-          <w:sz w:val="28"/>
-          <w:szCs w:val="28"/>
-        </w:rPr>
-        <w:tab/>
-      </w:r>
-    </w:p>
-    <w:p>
-      <w:pPr>
-        <w:tabs>
-          <w:tab w:val="left" w:pos="4395"/>
-        </w:tabs>
-        <w:ind w:left="720" w:firstLine="720"/>
-        <w:rPr>
-          <w:rFonts w:ascii="Arial" w:hAnsi="Arial" w:cs="Arial"/>
-          <w:sz w:val="28"/>
-          <w:szCs w:val="28"/>
-        </w:rPr>
-      </w:pPr>
-      <w:r>
-        <w:rPr>
-          <w:rFonts w:ascii="Arial" w:hAnsi="Arial" w:cs="Arial"/>
-          <w:sz w:val="28"/>
-          <w:szCs w:val="28"/>
-        </w:rPr>
-        <w:t xml:space="preserve">PROVINSI    </w:t>
-      </w:r>
-      <w:r>
-        <w:rPr>
-          <w:rFonts w:ascii="Arial" w:hAnsi="Arial" w:cs="Arial"/>
-          <w:sz w:val="28"/>
-          <w:szCs w:val="28"/>
-        </w:rPr>
-        <w:tab/>
-      </w:r>
-      <w:r>
-        <w:rPr>
-          <w:rFonts w:ascii="Arial" w:hAnsi="Arial" w:cs="Arial"/>
-          <w:sz w:val="28"/>
-          <w:szCs w:val="28"/>
-        </w:rPr>
-        <w:t>: {</w:t>
-      </w:r>
+      <w:proofErr w:type="spellStart"/>
       <w:r>
         <w:rPr>
           <w:rFonts w:ascii="Arial" w:hAnsi="Arial" w:cs="Arial"/>
@@ -874,6 +979,7 @@
         </w:rPr>
         <w:t>prov_lembaga</w:t>
       </w:r>
+      <w:proofErr w:type="spellEnd"/>
       <w:r>
         <w:rPr>
           <w:rFonts w:ascii="Arial" w:hAnsi="Arial" w:cs="Arial"/>
@@ -1044,53 +1150,31 @@
         </w:rPr>
         <w:t xml:space="preserve">Nama </w:t>
       </w:r>
-      <w:r>
-        <w:rPr>
-          <w:rFonts w:ascii="Arial" w:hAnsi="Arial" w:cs="Arial"/>
-          <w:sz w:val="28"/>
-          <w:szCs w:val="28"/>
-        </w:rPr>
-        <w:t>Lengkap</w:t>
-      </w:r>
-      <w:r>
-        <w:rPr>
-          <w:rFonts w:ascii="Arial" w:hAnsi="Arial" w:cs="Arial"/>
-          <w:sz w:val="28"/>
-          <w:szCs w:val="28"/>
-        </w:rPr>
-        <w:t xml:space="preserve">  </w:t>
-      </w:r>
-      <w:r>
-        <w:rPr>
-          <w:rFonts w:ascii="Arial" w:hAnsi="Arial" w:cs="Arial"/>
-          <w:sz w:val="28"/>
-          <w:szCs w:val="28"/>
-        </w:rPr>
-        <w:tab/>
-      </w:r>
-      <w:r>
-        <w:rPr>
-          <w:rFonts w:ascii="Arial" w:hAnsi="Arial" w:cs="Arial"/>
-          <w:sz w:val="28"/>
-          <w:szCs w:val="28"/>
-        </w:rPr>
-        <w:t>: {</w:t>
-      </w:r>
-      <w:r>
-        <w:rPr>
-          <w:rFonts w:ascii="Arial" w:hAnsi="Arial" w:cs="Arial"/>
-          <w:sz w:val="28"/>
-          <w:szCs w:val="28"/>
-        </w:rPr>
-        <w:t>nama_lengkap</w:t>
-      </w:r>
-      <w:r>
-        <w:rPr>
-          <w:rFonts w:ascii="Arial" w:hAnsi="Arial" w:cs="Arial"/>
-          <w:sz w:val="28"/>
-          <w:szCs w:val="28"/>
-        </w:rPr>
-        <w:t>}</w:t>
+      <w:proofErr w:type="gramStart"/>
+      <w:r>
+        <w:rPr>
+          <w:rFonts w:ascii="Arial" w:hAnsi="Arial" w:cs="Arial"/>
+          <w:sz w:val="28"/>
+          <w:szCs w:val="28"/>
+        </w:rPr>
+        <w:t xml:space="preserve">Lengkap  </w:t>
+      </w:r>
+      <w:r>
+        <w:rPr>
+          <w:rFonts w:ascii="Arial" w:hAnsi="Arial" w:cs="Arial"/>
+          <w:sz w:val="28"/>
+          <w:szCs w:val="28"/>
+        </w:rPr>
+        <w:tab/>
+      </w:r>
+      <w:proofErr w:type="gramEnd"/>
+      <w:r>
+        <w:rPr>
+          <w:rFonts w:ascii="Arial" w:hAnsi="Arial" w:cs="Arial"/>
+          <w:sz w:val="28"/>
+          <w:szCs w:val="28"/>
+        </w:rPr>
+        <w:t>: {nama_lengkap}</w:t>
       </w:r>
       <w:r>
         <w:rPr>
@@ -1133,53 +1217,31 @@
         </w:rPr>
         <w:t xml:space="preserve">Nama </w:t>
       </w:r>
-      <w:r>
-        <w:rPr>
-          <w:rFonts w:ascii="Arial" w:hAnsi="Arial" w:cs="Arial"/>
-          <w:sz w:val="28"/>
-          <w:szCs w:val="28"/>
-        </w:rPr>
-        <w:t>Panggilan</w:t>
-      </w:r>
-      <w:r>
-        <w:rPr>
-          <w:rFonts w:ascii="Arial" w:hAnsi="Arial" w:cs="Arial"/>
-          <w:sz w:val="28"/>
-          <w:szCs w:val="28"/>
-        </w:rPr>
-        <w:t xml:space="preserve">  </w:t>
-      </w:r>
-      <w:r>
-        <w:rPr>
-          <w:rFonts w:ascii="Arial" w:hAnsi="Arial" w:cs="Arial"/>
-          <w:sz w:val="28"/>
-          <w:szCs w:val="28"/>
-        </w:rPr>
-        <w:tab/>
-      </w:r>
-      <w:r>
-        <w:rPr>
-          <w:rFonts w:ascii="Arial" w:hAnsi="Arial" w:cs="Arial"/>
-          <w:sz w:val="28"/>
-          <w:szCs w:val="28"/>
-        </w:rPr>
-        <w:t>: {</w:t>
-      </w:r>
-      <w:r>
-        <w:rPr>
-          <w:rFonts w:ascii="Arial" w:hAnsi="Arial" w:cs="Arial"/>
-          <w:sz w:val="28"/>
-          <w:szCs w:val="28"/>
-        </w:rPr>
-        <w:t>nama_panggilan</w:t>
-      </w:r>
-      <w:r>
-        <w:rPr>
-          <w:rFonts w:ascii="Arial" w:hAnsi="Arial" w:cs="Arial"/>
-          <w:sz w:val="28"/>
-          <w:szCs w:val="28"/>
-        </w:rPr>
-        <w:t>}</w:t>
+      <w:proofErr w:type="gramStart"/>
+      <w:r>
+        <w:rPr>
+          <w:rFonts w:ascii="Arial" w:hAnsi="Arial" w:cs="Arial"/>
+          <w:sz w:val="28"/>
+          <w:szCs w:val="28"/>
+        </w:rPr>
+        <w:t xml:space="preserve">Panggilan  </w:t>
+      </w:r>
+      <w:r>
+        <w:rPr>
+          <w:rFonts w:ascii="Arial" w:hAnsi="Arial" w:cs="Arial"/>
+          <w:sz w:val="28"/>
+          <w:szCs w:val="28"/>
+        </w:rPr>
+        <w:tab/>
+      </w:r>
+      <w:proofErr w:type="gramEnd"/>
+      <w:r>
+        <w:rPr>
+          <w:rFonts w:ascii="Arial" w:hAnsi="Arial" w:cs="Arial"/>
+          <w:sz w:val="28"/>
+          <w:szCs w:val="28"/>
+        </w:rPr>
+        <w:t>: {nama_panggilan}</w:t>
       </w:r>
       <w:r>
         <w:rPr>
@@ -1221,31 +1283,7 @@
           <w:sz w:val="28"/>
           <w:szCs w:val="28"/>
         </w:rPr>
-        <w:t>Nomor</w:t>
-      </w:r>
-      <w:r>
-        <w:rPr>
-          <w:rFonts w:ascii="Arial" w:hAnsi="Arial" w:cs="Arial"/>
-          <w:sz w:val="28"/>
-          <w:szCs w:val="28"/>
-        </w:rPr>
-        <w:t xml:space="preserve"> </w:t>
-      </w:r>
-      <w:r>
-        <w:rPr>
-          <w:rFonts w:ascii="Arial" w:hAnsi="Arial" w:cs="Arial"/>
-          <w:sz w:val="28"/>
-          <w:szCs w:val="28"/>
-        </w:rPr>
-        <w:t>Induk</w:t>
-      </w:r>
-      <w:r>
-        <w:rPr>
-          <w:rFonts w:ascii="Arial" w:hAnsi="Arial" w:cs="Arial"/>
-          <w:sz w:val="28"/>
-          <w:szCs w:val="28"/>
-        </w:rPr>
-        <w:t xml:space="preserve"> / NISN </w:t>
+        <w:t xml:space="preserve">Nomor Induk / NISN </w:t>
       </w:r>
       <w:r>
         <w:rPr>
@@ -1269,15 +1307,7 @@
           <w:sz w:val="28"/>
           <w:szCs w:val="28"/>
         </w:rPr>
-        <w:t>{</w:t>
-      </w:r>
-      <w:r>
-        <w:rPr>
-          <w:rFonts w:ascii="Arial" w:hAnsi="Arial" w:cs="Arial"/>
-          <w:sz w:val="28"/>
-          <w:szCs w:val="28"/>
-        </w:rPr>
-        <w:t>ni</w:t>
+        <w:t>{ni</w:t>
       </w:r>
       <w:r>
         <w:rPr>
@@ -1309,23 +1339,7 @@
           <w:sz w:val="28"/>
           <w:szCs w:val="28"/>
         </w:rPr>
-        <w:t>{</w:t>
-      </w:r>
-      <w:r>
-        <w:rPr>
-          <w:rFonts w:ascii="Arial" w:hAnsi="Arial" w:cs="Arial"/>
-          <w:sz w:val="28"/>
-          <w:szCs w:val="28"/>
-        </w:rPr>
-        <w:t>nisn</w:t>
-      </w:r>
-      <w:r>
-        <w:rPr>
-          <w:rFonts w:ascii="Arial" w:hAnsi="Arial" w:cs="Arial"/>
-          <w:sz w:val="28"/>
-          <w:szCs w:val="28"/>
-        </w:rPr>
-        <w:t>}</w:t>
+        <w:t>{nisn}</w:t>
       </w:r>
       <w:r>
         <w:rPr>
@@ -1359,39 +1373,33 @@
           <w:sz w:val="28"/>
           <w:szCs w:val="28"/>
         </w:rPr>
-        <w:t xml:space="preserve">Jenis Kelamin  </w:t>
-      </w:r>
-      <w:r>
-        <w:rPr>
-          <w:rFonts w:ascii="Arial" w:hAnsi="Arial" w:cs="Arial"/>
-          <w:sz w:val="28"/>
-          <w:szCs w:val="28"/>
-        </w:rPr>
-        <w:tab/>
-      </w:r>
-      <w:r>
-        <w:rPr>
-          <w:rFonts w:ascii="Arial" w:hAnsi="Arial" w:cs="Arial"/>
-          <w:sz w:val="28"/>
-          <w:szCs w:val="28"/>
-        </w:rPr>
-        <w:t>: {</w:t>
-      </w:r>
-      <w:r>
-        <w:rPr>
-          <w:rFonts w:ascii="Arial" w:hAnsi="Arial" w:cs="Arial"/>
-          <w:sz w:val="28"/>
-          <w:szCs w:val="28"/>
-        </w:rPr>
-        <w:t>jenis_kelamin</w:t>
-      </w:r>
-      <w:r>
-        <w:rPr>
-          <w:rFonts w:ascii="Arial" w:hAnsi="Arial" w:cs="Arial"/>
-          <w:sz w:val="28"/>
-          <w:szCs w:val="28"/>
-        </w:rPr>
-        <w:t>}</w:t>
+        <w:t xml:space="preserve">Jenis </w:t>
+      </w:r>
+      <w:proofErr w:type="gramStart"/>
+      <w:r>
+        <w:rPr>
+          <w:rFonts w:ascii="Arial" w:hAnsi="Arial" w:cs="Arial"/>
+          <w:sz w:val="28"/>
+          <w:szCs w:val="28"/>
+        </w:rPr>
+        <w:t xml:space="preserve">Kelamin  </w:t>
+      </w:r>
+      <w:r>
+        <w:rPr>
+          <w:rFonts w:ascii="Arial" w:hAnsi="Arial" w:cs="Arial"/>
+          <w:sz w:val="28"/>
+          <w:szCs w:val="28"/>
+        </w:rPr>
+        <w:tab/>
+      </w:r>
+      <w:proofErr w:type="gramEnd"/>
+      <w:r>
+        <w:rPr>
+          <w:rFonts w:ascii="Arial" w:hAnsi="Arial" w:cs="Arial"/>
+          <w:sz w:val="28"/>
+          <w:szCs w:val="28"/>
+        </w:rPr>
+        <w:t>: {jenis_kelamin}</w:t>
       </w:r>
       <w:r>
         <w:rPr>
@@ -1433,63 +1441,23 @@
           <w:sz w:val="28"/>
           <w:szCs w:val="28"/>
         </w:rPr>
-        <w:t>Tempat</w:t>
-      </w:r>
-      <w:r>
-        <w:rPr>
-          <w:rFonts w:ascii="Arial" w:hAnsi="Arial" w:cs="Arial"/>
-          <w:sz w:val="28"/>
-          <w:szCs w:val="28"/>
-        </w:rPr>
-        <w:t xml:space="preserve"> / </w:t>
-      </w:r>
-      <w:r>
-        <w:rPr>
-          <w:rFonts w:ascii="Arial" w:hAnsi="Arial" w:cs="Arial"/>
-          <w:sz w:val="28"/>
-          <w:szCs w:val="28"/>
-        </w:rPr>
-        <w:t>tanggal</w:t>
-      </w:r>
-      <w:r>
-        <w:rPr>
-          <w:rFonts w:ascii="Arial" w:hAnsi="Arial" w:cs="Arial"/>
-          <w:sz w:val="28"/>
-          <w:szCs w:val="28"/>
-        </w:rPr>
-        <w:t xml:space="preserve"> Lahir </w:t>
-      </w:r>
-      <w:r>
-        <w:rPr>
-          <w:rFonts w:ascii="Arial" w:hAnsi="Arial" w:cs="Arial"/>
-          <w:sz w:val="28"/>
-          <w:szCs w:val="28"/>
-        </w:rPr>
-        <w:tab/>
-      </w:r>
-      <w:r>
-        <w:rPr>
-          <w:rFonts w:ascii="Arial" w:hAnsi="Arial" w:cs="Arial"/>
-          <w:sz w:val="28"/>
-          <w:szCs w:val="28"/>
-        </w:rPr>
-        <w:t>: {</w:t>
-      </w:r>
-      <w:r>
-        <w:rPr>
-          <w:rFonts w:ascii="Arial" w:hAnsi="Arial" w:cs="Arial"/>
-          <w:sz w:val="28"/>
-          <w:szCs w:val="28"/>
-        </w:rPr>
-        <w:t>tempat_tanggal_lahir</w:t>
-      </w:r>
-      <w:r>
-        <w:rPr>
-          <w:rFonts w:ascii="Arial" w:hAnsi="Arial" w:cs="Arial"/>
-          <w:sz w:val="28"/>
-          <w:szCs w:val="28"/>
-        </w:rPr>
-        <w:t>}</w:t>
+        <w:t xml:space="preserve">Tempat / tanggal Lahir </w:t>
+      </w:r>
+      <w:r>
+        <w:rPr>
+          <w:rFonts w:ascii="Arial" w:hAnsi="Arial" w:cs="Arial"/>
+          <w:sz w:val="28"/>
+          <w:szCs w:val="28"/>
+        </w:rPr>
+        <w:tab/>
+      </w:r>
+      <w:r>
+        <w:rPr>
+          <w:rFonts w:ascii="Arial" w:hAnsi="Arial" w:cs="Arial"/>
+          <w:sz w:val="28"/>
+          <w:szCs w:val="28"/>
+        </w:rPr>
+        <w:t>: {tempat_tanggal_lahir}</w:t>
       </w:r>
       <w:r>
         <w:rPr>
@@ -1597,23 +1565,7 @@
           <w:sz w:val="28"/>
           <w:szCs w:val="28"/>
         </w:rPr>
-        <w:t xml:space="preserve">Anak </w:t>
-      </w:r>
-      <w:r>
-        <w:rPr>
-          <w:rFonts w:ascii="Arial" w:hAnsi="Arial" w:cs="Arial"/>
-          <w:sz w:val="28"/>
-          <w:szCs w:val="28"/>
-        </w:rPr>
-        <w:t>ke</w:t>
-      </w:r>
-      <w:r>
-        <w:rPr>
-          <w:rFonts w:ascii="Arial" w:hAnsi="Arial" w:cs="Arial"/>
-          <w:sz w:val="28"/>
-          <w:szCs w:val="28"/>
-        </w:rPr>
-        <w:t xml:space="preserve">     </w:t>
+        <w:t xml:space="preserve">Anak ke     </w:t>
       </w:r>
       <w:r>
         <w:rPr>
@@ -1645,23 +1597,7 @@
           <w:sz w:val="28"/>
           <w:szCs w:val="28"/>
         </w:rPr>
-        <w:t>{</w:t>
-      </w:r>
-      <w:r>
-        <w:rPr>
-          <w:rFonts w:ascii="Arial" w:hAnsi="Arial" w:cs="Arial"/>
-          <w:sz w:val="28"/>
-          <w:szCs w:val="28"/>
-        </w:rPr>
-        <w:t>anak_ke</w:t>
-      </w:r>
-      <w:r>
-        <w:rPr>
-          <w:rFonts w:ascii="Arial" w:hAnsi="Arial" w:cs="Arial"/>
-          <w:sz w:val="28"/>
-          <w:szCs w:val="28"/>
-        </w:rPr>
-        <w:t>}</w:t>
+        <w:t>{anak_ke}</w:t>
       </w:r>
       <w:r>
         <w:rPr>
@@ -1776,23 +1712,7 @@
           <w:sz w:val="28"/>
           <w:szCs w:val="28"/>
         </w:rPr>
-        <w:t>: {</w:t>
-      </w:r>
-      <w:r>
-        <w:rPr>
-          <w:rFonts w:ascii="Arial" w:hAnsi="Arial" w:cs="Arial"/>
-          <w:sz w:val="28"/>
-          <w:szCs w:val="28"/>
-        </w:rPr>
-        <w:t>nama_ayah</w:t>
-      </w:r>
-      <w:r>
-        <w:rPr>
-          <w:rFonts w:ascii="Arial" w:hAnsi="Arial" w:cs="Arial"/>
-          <w:sz w:val="28"/>
-          <w:szCs w:val="28"/>
-        </w:rPr>
-        <w:t>}</w:t>
+        <w:t>: {nama_ayah}</w:t>
       </w:r>
       <w:r>
         <w:rPr>
@@ -1866,23 +1786,7 @@
           <w:szCs w:val="28"/>
         </w:rPr>
         <w:tab/>
-        <w:t>: {</w:t>
-      </w:r>
-      <w:r>
-        <w:rPr>
-          <w:rFonts w:ascii="Arial" w:hAnsi="Arial" w:cs="Arial"/>
-          <w:sz w:val="28"/>
-          <w:szCs w:val="28"/>
-        </w:rPr>
-        <w:t>nama_ibu</w:t>
-      </w:r>
-      <w:r>
-        <w:rPr>
-          <w:rFonts w:ascii="Arial" w:hAnsi="Arial" w:cs="Arial"/>
-          <w:sz w:val="28"/>
-          <w:szCs w:val="28"/>
-        </w:rPr>
-        <w:t>}</w:t>
+        <w:t>: {nama_ibu}</w:t>
       </w:r>
       <w:r>
         <w:rPr>
@@ -1940,15 +1844,7 @@
           <w:sz w:val="28"/>
           <w:szCs w:val="28"/>
         </w:rPr>
-        <w:t>Pekerjaan</w:t>
-      </w:r>
-      <w:r>
-        <w:rPr>
-          <w:rFonts w:ascii="Arial" w:hAnsi="Arial" w:cs="Arial"/>
-          <w:sz w:val="28"/>
-          <w:szCs w:val="28"/>
-        </w:rPr>
-        <w:t xml:space="preserve"> Orang Tua / Wali</w:t>
+        <w:t>Pekerjaan Orang Tua / Wali</w:t>
       </w:r>
     </w:p>
     <w:p>
@@ -1990,23 +1886,7 @@
           <w:szCs w:val="28"/>
         </w:rPr>
         <w:tab/>
-        <w:t>: {</w:t>
-      </w:r>
-      <w:r>
-        <w:rPr>
-          <w:rFonts w:ascii="Arial" w:hAnsi="Arial" w:cs="Arial"/>
-          <w:sz w:val="28"/>
-          <w:szCs w:val="28"/>
-        </w:rPr>
-        <w:t>pekerjaan_ayah</w:t>
-      </w:r>
-      <w:r>
-        <w:rPr>
-          <w:rFonts w:ascii="Arial" w:hAnsi="Arial" w:cs="Arial"/>
-          <w:sz w:val="28"/>
-          <w:szCs w:val="28"/>
-        </w:rPr>
-        <w:t>}</w:t>
+        <w:t>: {pekerjaan_ayah}</w:t>
       </w:r>
       <w:r>
         <w:rPr>
@@ -2072,23 +1952,7 @@
           <w:szCs w:val="28"/>
         </w:rPr>
         <w:tab/>
-        <w:t>: {</w:t>
-      </w:r>
-      <w:r>
-        <w:rPr>
-          <w:rFonts w:ascii="Arial" w:hAnsi="Arial" w:cs="Arial"/>
-          <w:sz w:val="28"/>
-          <w:szCs w:val="28"/>
-        </w:rPr>
-        <w:t>pekerjaan_ibu</w:t>
-      </w:r>
-      <w:r>
-        <w:rPr>
-          <w:rFonts w:ascii="Arial" w:hAnsi="Arial" w:cs="Arial"/>
-          <w:sz w:val="28"/>
-          <w:szCs w:val="28"/>
-        </w:rPr>
-        <w:t>}</w:t>
+        <w:t>: {pekerjaan_ibu}</w:t>
       </w:r>
       <w:r>
         <w:rPr>
@@ -2212,23 +2076,7 @@
           <w:sz w:val="28"/>
           <w:szCs w:val="28"/>
         </w:rPr>
-        <w:t>{</w:t>
-      </w:r>
-      <w:r>
-        <w:rPr>
-          <w:rFonts w:ascii="Arial" w:hAnsi="Arial" w:cs="Arial"/>
-          <w:sz w:val="28"/>
-          <w:szCs w:val="28"/>
-        </w:rPr>
-        <w:t>alamat_jalan</w:t>
-      </w:r>
-      <w:r>
-        <w:rPr>
-          <w:rFonts w:ascii="Arial" w:hAnsi="Arial" w:cs="Arial"/>
-          <w:sz w:val="28"/>
-          <w:szCs w:val="28"/>
-        </w:rPr>
-        <w:t>}</w:t>
+        <w:t>{alamat_jalan}</w:t>
       </w:r>
       <w:r>
         <w:rPr>
@@ -2239,37 +2087,23 @@
         <w:br/>
         <w:t xml:space="preserve">                                     </w:t>
       </w:r>
-      <w:r>
-        <w:rPr>
-          <w:rFonts w:ascii="Arial" w:hAnsi="Arial" w:cs="Arial"/>
-          <w:sz w:val="28"/>
-          <w:szCs w:val="28"/>
-        </w:rPr>
-        <w:t>Telepon</w:t>
-      </w:r>
-      <w:r>
-        <w:rPr>
-          <w:rFonts w:ascii="Arial" w:hAnsi="Arial" w:cs="Arial"/>
-          <w:sz w:val="28"/>
-          <w:szCs w:val="28"/>
-        </w:rPr>
-        <w:t xml:space="preserve"> : {</w:t>
-      </w:r>
-      <w:r>
-        <w:rPr>
-          <w:rFonts w:ascii="Arial" w:hAnsi="Arial" w:cs="Arial"/>
-          <w:sz w:val="28"/>
-          <w:szCs w:val="28"/>
-        </w:rPr>
-        <w:t>telepon</w:t>
-      </w:r>
-      <w:r>
-        <w:rPr>
-          <w:rFonts w:ascii="Arial" w:hAnsi="Arial" w:cs="Arial"/>
-          <w:sz w:val="28"/>
-          <w:szCs w:val="28"/>
-        </w:rPr>
-        <w:t>}</w:t>
+      <w:proofErr w:type="gramStart"/>
+      <w:r>
+        <w:rPr>
+          <w:rFonts w:ascii="Arial" w:hAnsi="Arial" w:cs="Arial"/>
+          <w:sz w:val="28"/>
+          <w:szCs w:val="28"/>
+        </w:rPr>
+        <w:t>Telepon :</w:t>
+      </w:r>
+      <w:proofErr w:type="gramEnd"/>
+      <w:r>
+        <w:rPr>
+          <w:rFonts w:ascii="Arial" w:hAnsi="Arial" w:cs="Arial"/>
+          <w:sz w:val="28"/>
+          <w:szCs w:val="28"/>
+        </w:rPr>
+        <w:t xml:space="preserve"> {telepon}</w:t>
       </w:r>
     </w:p>
     <w:p>
@@ -2343,23 +2177,7 @@
           <w:sz w:val="28"/>
           <w:szCs w:val="28"/>
         </w:rPr>
-        <w:t>{</w:t>
-      </w:r>
-      <w:r>
-        <w:rPr>
-          <w:rFonts w:ascii="Arial" w:hAnsi="Arial" w:cs="Arial"/>
-          <w:sz w:val="28"/>
-          <w:szCs w:val="28"/>
-        </w:rPr>
-        <w:t>desa</w:t>
-      </w:r>
-      <w:r>
-        <w:rPr>
-          <w:rFonts w:ascii="Arial" w:hAnsi="Arial" w:cs="Arial"/>
-          <w:sz w:val="28"/>
-          <w:szCs w:val="28"/>
-        </w:rPr>
-        <w:t>}</w:t>
+        <w:t>{desa}</w:t>
       </w:r>
       <w:r>
         <w:rPr>
@@ -2409,15 +2227,7 @@
           <w:sz w:val="28"/>
           <w:szCs w:val="28"/>
         </w:rPr>
-        <w:t>Kecamatan</w:t>
-      </w:r>
-      <w:r>
-        <w:rPr>
-          <w:rFonts w:ascii="Arial" w:hAnsi="Arial" w:cs="Arial"/>
-          <w:sz w:val="28"/>
-          <w:szCs w:val="28"/>
-        </w:rPr>
-        <w:t xml:space="preserve">   </w:t>
+        <w:t xml:space="preserve">Kecamatan   </w:t>
       </w:r>
       <w:r>
         <w:rPr>
@@ -2457,23 +2267,7 @@
           <w:sz w:val="28"/>
           <w:szCs w:val="28"/>
         </w:rPr>
-        <w:t>{</w:t>
-      </w:r>
-      <w:r>
-        <w:rPr>
-          <w:rFonts w:ascii="Arial" w:hAnsi="Arial" w:cs="Arial"/>
-          <w:sz w:val="28"/>
-          <w:szCs w:val="28"/>
-        </w:rPr>
-        <w:t>kecamatan</w:t>
-      </w:r>
-      <w:r>
-        <w:rPr>
-          <w:rFonts w:ascii="Arial" w:hAnsi="Arial" w:cs="Arial"/>
-          <w:sz w:val="28"/>
-          <w:szCs w:val="28"/>
-        </w:rPr>
-        <w:t>}</w:t>
+        <w:t>{kecamatan}</w:t>
       </w:r>
       <w:r>
         <w:rPr>
@@ -2523,15 +2317,7 @@
           <w:sz w:val="28"/>
           <w:szCs w:val="28"/>
         </w:rPr>
-        <w:t>Kabupaten</w:t>
-      </w:r>
-      <w:r>
-        <w:rPr>
-          <w:rFonts w:ascii="Arial" w:hAnsi="Arial" w:cs="Arial"/>
-          <w:sz w:val="28"/>
-          <w:szCs w:val="28"/>
-        </w:rPr>
-        <w:t xml:space="preserve">   </w:t>
+        <w:t xml:space="preserve">Kabupaten   </w:t>
       </w:r>
       <w:r>
         <w:rPr>
@@ -2571,23 +2357,7 @@
           <w:sz w:val="28"/>
           <w:szCs w:val="28"/>
         </w:rPr>
-        <w:t>{</w:t>
-      </w:r>
-      <w:r>
-        <w:rPr>
-          <w:rFonts w:ascii="Arial" w:hAnsi="Arial" w:cs="Arial"/>
-          <w:sz w:val="28"/>
-          <w:szCs w:val="28"/>
-        </w:rPr>
-        <w:t>kabupaten</w:t>
-      </w:r>
-      <w:r>
-        <w:rPr>
-          <w:rFonts w:ascii="Arial" w:hAnsi="Arial" w:cs="Arial"/>
-          <w:sz w:val="28"/>
-          <w:szCs w:val="28"/>
-        </w:rPr>
-        <w:t>}</w:t>
+        <w:t>{kabupaten}</w:t>
       </w:r>
       <w:r>
         <w:rPr>
@@ -2637,55 +2407,31 @@
           <w:sz w:val="28"/>
           <w:szCs w:val="28"/>
         </w:rPr>
-        <w:t>Provinsi</w:t>
-      </w:r>
-      <w:r>
-        <w:rPr>
-          <w:rFonts w:ascii="Arial" w:hAnsi="Arial" w:cs="Arial"/>
-          <w:sz w:val="28"/>
-          <w:szCs w:val="28"/>
-        </w:rPr>
-        <w:t xml:space="preserve">   </w:t>
-      </w:r>
-      <w:r>
-        <w:rPr>
-          <w:rFonts w:ascii="Arial" w:hAnsi="Arial" w:cs="Arial"/>
-          <w:sz w:val="28"/>
-          <w:szCs w:val="28"/>
-        </w:rPr>
-        <w:tab/>
-      </w:r>
-      <w:r>
-        <w:rPr>
-          <w:rFonts w:ascii="Arial" w:hAnsi="Arial" w:cs="Arial"/>
-          <w:sz w:val="28"/>
-          <w:szCs w:val="28"/>
-        </w:rPr>
-        <w:tab/>
-      </w:r>
-      <w:r>
-        <w:rPr>
-          <w:rFonts w:ascii="Arial" w:hAnsi="Arial" w:cs="Arial"/>
-          <w:sz w:val="28"/>
-          <w:szCs w:val="28"/>
-        </w:rPr>
-        <w:t>: {</w:t>
-      </w:r>
-      <w:r>
-        <w:rPr>
-          <w:rFonts w:ascii="Arial" w:hAnsi="Arial" w:cs="Arial"/>
-          <w:sz w:val="28"/>
-          <w:szCs w:val="28"/>
-        </w:rPr>
-        <w:t>provinsi</w:t>
-      </w:r>
-      <w:r>
-        <w:rPr>
-          <w:rFonts w:ascii="Arial" w:hAnsi="Arial" w:cs="Arial"/>
-          <w:sz w:val="28"/>
-          <w:szCs w:val="28"/>
-        </w:rPr>
-        <w:t>}</w:t>
+        <w:t xml:space="preserve">Provinsi   </w:t>
+      </w:r>
+      <w:r>
+        <w:rPr>
+          <w:rFonts w:ascii="Arial" w:hAnsi="Arial" w:cs="Arial"/>
+          <w:sz w:val="28"/>
+          <w:szCs w:val="28"/>
+        </w:rPr>
+        <w:tab/>
+      </w:r>
+      <w:r>
+        <w:rPr>
+          <w:rFonts w:ascii="Arial" w:hAnsi="Arial" w:cs="Arial"/>
+          <w:sz w:val="28"/>
+          <w:szCs w:val="28"/>
+        </w:rPr>
+        <w:tab/>
+      </w:r>
+      <w:r>
+        <w:rPr>
+          <w:rFonts w:ascii="Arial" w:hAnsi="Arial" w:cs="Arial"/>
+          <w:sz w:val="28"/>
+          <w:szCs w:val="28"/>
+        </w:rPr>
+        <w:t>: {provinsi}</w:t>
       </w:r>
       <w:r>
         <w:rPr>
@@ -2826,23 +2572,7 @@
           <w:sz w:val="28"/>
           <w:szCs w:val="28"/>
         </w:rPr>
-        <w:t>{</w:t>
-      </w:r>
-      <w:r>
-        <w:rPr>
-          <w:rFonts w:ascii="Arial" w:hAnsi="Arial" w:cs="Arial"/>
-          <w:sz w:val="28"/>
-          <w:szCs w:val="28"/>
-        </w:rPr>
-        <w:t>tanggal_identitas</w:t>
-      </w:r>
-      <w:r>
-        <w:rPr>
-          <w:rFonts w:ascii="Arial" w:hAnsi="Arial" w:cs="Arial"/>
-          <w:sz w:val="28"/>
-          <w:szCs w:val="28"/>
-        </w:rPr>
-        <w:t>}</w:t>
+        <w:t>{tanggal_identitas}</w:t>
       </w:r>
     </w:p>
     <w:p>
@@ -2864,13 +2594,6 @@
           <w:szCs w:val="28"/>
         </w:rPr>
         <w:tab/>
-      </w:r>
-      <w:r>
-        <w:rPr>
-          <w:rFonts w:ascii="Arial" w:hAnsi="Arial" w:cs="Arial"/>
-          <w:sz w:val="28"/>
-          <w:szCs w:val="28"/>
-        </w:rPr>
         <w:t>Kepala</w:t>
       </w:r>
       <w:r>
@@ -2921,23 +2644,7 @@
           <w:szCs w:val="28"/>
         </w:rPr>
         <w:tab/>
-        <w:t>{</w:t>
-      </w:r>
-      <w:r>
-        <w:rPr>
-          <w:rFonts w:ascii="Arial" w:hAnsi="Arial" w:cs="Arial"/>
-          <w:sz w:val="28"/>
-          <w:szCs w:val="28"/>
-        </w:rPr>
-        <w:t>nama_tk_lembaga</w:t>
-      </w:r>
-      <w:r>
-        <w:rPr>
-          <w:rFonts w:ascii="Arial" w:hAnsi="Arial" w:cs="Arial"/>
-          <w:sz w:val="28"/>
-          <w:szCs w:val="28"/>
-        </w:rPr>
-        <w:t>}</w:t>
+        <w:t>{nama_tk_lembaga}</w:t>
       </w:r>
     </w:p>
     <w:p>
@@ -3016,6 +2723,7 @@
         </w:rPr>
         <w:t xml:space="preserve">INDAH ROHMAWATI, </w:t>
       </w:r>
+      <w:proofErr w:type="gramStart"/>
       <w:r>
         <w:rPr>
           <w:rFonts w:ascii="Arial" w:hAnsi="Arial" w:cs="Arial"/>
@@ -3025,6 +2733,7 @@
         </w:rPr>
         <w:t>S.Pd</w:t>
       </w:r>
+      <w:proofErr w:type="gramEnd"/>
     </w:p>
     <w:p>
       <w:pPr>

</xml_diff>